<commit_message>
InfoQ CADEC article: final read-through — the opening's unsupported 40 percent corrected to one in three, Figure 2's alternatives named, six joins smoothed, budget held
Co-Authored-By: Claude Fable 5.1 <noreply@anthropic.com>
</commit_message>
<xml_diff>
--- a/docs/Group 3 – Testing Six LLM Reliability Layers: What Each Bought and What It Cost.docx
+++ b/docs/Group 3 – Testing Six LLM Reliability Layers: What Each Bought and What It Cost.docx
@@ -84,7 +84,7 @@
         </w:numPr>
       </w:pPr>
       <w:r>
-        <w:t xml:space="preserve">Make repeat runs a validation step: rerun the same inputs, measure how far answers move and set the difference you accept; ours agreed 70 percent.</w:t>
+        <w:t xml:space="preserve">Make repeat runs a validation step: rerun the same inputs, measure how far answers move and set the difference you accept; ours agreed on 70 percent.</w:t>
       </w:r>
     </w:p>
     <w:p>
@@ -121,7 +121,7 @@
         <w:pStyle w:val="FirstParagraph"/>
       </w:pPr>
       <w:r>
-        <w:t xml:space="preserve">Clinical notes, incident reports, support tickets and forum posts are prose, and a language model can read them. What it reads out is not dependable. Ours was 40 percent right on the task below and reported full confidence on two thirds of its answers; wherever a wrong answer costs something, that is unusable.</w:t>
+        <w:t xml:space="preserve">Clinical notes, incident reports, support tickets and forum posts are prose, and a language model can read them. What it produces is not dependable. Ours was right about one answer in three on the task below and reported full confidence on two thirds of its answers; wherever a wrong answer costs something, that is unusable.</w:t>
       </w:r>
     </w:p>
     <w:p>
@@ -129,7 +129,7 @@
         <w:pStyle w:val="BodyText"/>
       </w:pPr>
       <w:r>
-        <w:t xml:space="preserve">We tested six layers that each evaluate the model's output and flag what is wrong so that it can be put right: check each answer against something deterministic, send provable failures back to the model [1], sample it several times and vote [2], have a second model judge it [3], withhold what cannot be corroborated, and send the rest to a person. The theory we set out to test is the one that justifies stacking them: each layer catches errors the layers below missed, so accuracy rises with every layer added. We ran all six on the same records, each priced, with the free deterministic check entered as a competitor. The theory did not hold. The layers sorted the answers by how far to trust them and corrected almost none.</w:t>
+        <w:t xml:space="preserve">We tested six layers that each evaluate the model's output and flag what is wrong so that it can be put right: check each answer against something deterministic, send provable failures back to the model [1], sample it several times and vote [2], have a second model judge it [3], withhold what cannot be corroborated, and send the rest to a person. The theory we set out to test is the one that justifies stacking them: each layer catches errors the layers below missed, so accuracy rises with every layer added. We ran all six on the same records, each priced, with the free check entered as a competitor. The theory did not hold. The layers sorted the answers by how far to trust them and corrected almost none.</w:t>
       </w:r>
     </w:p>
     <w:p>
@@ -137,7 +137,7 @@
         <w:pStyle w:val="BodyText"/>
       </w:pPr>
       <w:r>
-        <w:t xml:space="preserve">Testing it needs a graded task, so we chose an annotated corpus: CADEC, the CSIRO Adverse Drug Event Corpus [4], 1,250 forum posts about two drugs, every adverse reaction marked as a span of the writer's own words and given a SNOMED CT code. A gold answer for every mention lets us score each layer's verdicts instead of trusting them. We did not build a CADEC system or tune for the corpus. The aim was to evaluate open-weight models and measure how much each layer raises their accuracy, and CADEC is the instrument.</w:t>
+        <w:t xml:space="preserve">Testing it needs a graded task, so we chose an annotated corpus: CADEC, the CSIRO Adverse Drug Event Corpus [4], 1,250 forum posts about two drugs, every adverse reaction marked as a span of the writer's own words and given a SNOMED CT code. A gold answer for every mention lets us score each layer's verdicts instead of trusting them. We did not build a CADEC system or tune for it: the aim was to evaluate open-weight models and measure how much each layer raises their accuracy, and CADEC is the instrument.</w:t>
       </w:r>
     </w:p>
     <w:p>
@@ -145,7 +145,7 @@
         <w:pStyle w:val="BodyText"/>
       </w:pPr>
       <w:r>
-        <w:t xml:space="preserve">A supervised system does far better. CONORM [5], fine-tuned on 875 of CADEC's 1,250 files, reaches an end-to-end F1 of 0.72 under lenient span matching. Our zero-shot extractor, everything it returns, reaches 0.47 to 0.50 under the same matching on our development split, 0.39 to 0.43 span-exact. We are not competing with it: it needs those 875 annotated files, and still cannot say which of its answers to trust, the question the layers exist to answer. Our held-out split was spent once, 60 documents, one run; every other number is development-side and says so. Two things would move the absolute numbers, the small judge and CADEC being, since 2015, almost certainly in training data; the comparisons between layers should hold.</w:t>
+        <w:t xml:space="preserve">A supervised system does far better. CONORM [5], fine-tuned on 875 of CADEC's 1,250 files, reaches an end-to-end F1 of 0.72 under lenient span matching. Our zero-shot extractor, everything it returns, reaches 0.47 to 0.50 under the same matching on our development split, 0.39 to 0.43 span-exact. We are not competing with it: it needs those 875 annotated files, and still cannot say which of its answers to trust. Our held-out split was spent once, 60 documents, one run; every other number is development-side and says so. Two things would move the absolute numbers: the judge is small, and CADEC, public since 2015, is almost certainly in its training data. The comparisons between layers should hold.</w:t>
       </w:r>
     </w:p>
     <w:bookmarkEnd w:id="10"/>
@@ -234,7 +234,7 @@
         <w:pStyle w:val="BodyText"/>
       </w:pPr>
       <w:r>
-        <w:t xml:space="preserve">The retriever searches 227,554 keyword-to-code rows; codes are written as</w:t>
+        <w:t xml:space="preserve">Behind the menu, a retriever with no model searches 227,554 keyword-to-code rows. Codes are written as</w:t>
       </w:r>
       <w:r>
         <w:t xml:space="preserve"> </w:t>
@@ -257,7 +257,7 @@
         <w:pStyle w:val="BodyText"/>
       </w:pPr>
       <w:r>
-        <w:t xml:space="preserve">We chose this shape by measuring the alternatives on 40 development documents, three cold runs each:</w:t>
+        <w:t xml:space="preserve">We chose this shape by measuring the alternatives on 40 development documents, three cold runs each: recall the code from memory, name the concept and look it up, or pick from the menu.</w:t>
       </w:r>
     </w:p>
     <w:p>
@@ -339,7 +339,7 @@
         <w:t xml:space="preserve"> </w:t>
       </w:r>
       <w:r>
-        <w:t xml:space="preserve">on up to 38 percent of records, and of the codes it committed to, 13 to 18 percent exist in no SNOMED release. An abstention option reduces fabrication; it does not remove it.</w:t>
+        <w:t xml:space="preserve">on up to 38 percent of records, and of the codes it committed to, 13 to 18 percent exist in no SNOMED release.</w:t>
       </w:r>
     </w:p>
     <w:p>
@@ -363,7 +363,7 @@
         <w:t xml:space="preserve"> </w:t>
       </w:r>
       <w:r>
-        <w:t xml:space="preserve">throughout: a quote with the wrong boundary is both a false positive and a false negative.</w:t>
+        <w:t xml:space="preserve">throughout: a wrong boundary is both a false positive and a false negative.</w:t>
       </w:r>
     </w:p>
     <w:p>
@@ -599,7 +599,7 @@
         <w:pStyle w:val="BodyText"/>
       </w:pPr>
       <w:r>
-        <w:t xml:space="preserve">The variation is a property of this model: four other families run three times each, llama3.1:8b, mistral:7b-instruct, qwen3:8b and granite4:micro-h, returned byte-identical output every time. Our extractor, gpt-oss:20b, is the only mixture-of-experts model of the five and the only one that varied; why it varies we could not settle, since the diverging request, sent alone eight times, returns one reply and moves only inside a full run. We kept it for its 6.5 extra points of F1 over llama3.1:8b.</w:t>
+        <w:t xml:space="preserve">The variation is a property of this model: four other families run three times each, llama3.1:8b, mistral:7b-instruct, qwen3:8b and granite4:micro-h, returned byte-identical output every time. Our extractor, gpt-oss:20b, is the only mixture-of-experts model of the five and the only one that varied. Why, we could not settle: the diverging request, sent alone eight times, returns one reply; it moves only inside a full run. We kept it for its 6.5 extra points of F1 over llama3.1:8b.</w:t>
       </w:r>
     </w:p>
     <w:p>
@@ -659,7 +659,7 @@
         <w:t xml:space="preserve"> </w:t>
       </w:r>
       <w:r>
-        <w:t xml:space="preserve">Three lanes. REJECT: the code does not exist or the quote is not in the post. ACCEPT: the span's words match one of the concept's own names,</w:t>
+        <w:t xml:space="preserve">It sorts every answer into three lanes. REJECT: the code does not exist or the quote is not in the post. ACCEPT: the span's words match one of the concept's own names,</w:t>
       </w:r>
       <w:r>
         <w:t xml:space="preserve"> </w:t>
@@ -674,7 +674,7 @@
         <w:t xml:space="preserve"> </w:t>
       </w:r>
       <w:r>
-        <w:t xml:space="preserve">against |Chronic pain|. BAND: neither. ACCEPT was 76 to 82 percent correct and BAND 27 to 30 percent, a 2.7 to 2.8× separation. The check can prove an answer wrong, never right, and its ceiling is that only 73 of 226 annotated mentions, 32 percent, are worded so a perfect answer could land in ACCEPT.</w:t>
+        <w:t xml:space="preserve">against |Chronic pain|. BAND: neither. ACCEPT was 76 to 82 percent correct and BAND 27 to 30 percent, a 2.7 to 2.8× separation. The check can prove an answer wrong, never right, and its ceiling is that only 32 percent of annotated mentions are worded so a perfect answer could land in ACCEPT.</w:t>
       </w:r>
     </w:p>
     <w:p>
@@ -775,7 +775,7 @@
         <w:t xml:space="preserve"> </w:t>
       </w:r>
       <w:r>
-        <w:t xml:space="preserve">It passes answers that meet a chosen verdict and holds the rest for a person. On the vocabulary check's ACCEPT, our measured setting, 21 to 23 percent of records pass at 0.74 to 0.82 accuracy. A confidence threshold was tried and retired: the extractor reports 1.0 on 66 percent of answers while right 39 percent of the time.</w:t>
+        <w:t xml:space="preserve">It passes answers that meet a chosen verdict and holds the rest for a person. On ACCEPT, our measured setting, 21 to 23 percent of records pass at 0.74 to 0.82 accuracy. A confidence threshold was tried and retired: the extractor's confidence is 1.0 on two thirds of answers, right or wrong.</w:t>
       </w:r>
     </w:p>
     <w:p>
@@ -805,7 +805,7 @@
         <w:pStyle w:val="FirstParagraph"/>
       </w:pPr>
       <w:r>
-        <w:t xml:space="preserve">Then we removed the three paid layers and replayed refusal over the same records:</w:t>
+        <w:t xml:space="preserve">Then we removed the three paid layers and replayed refusal:</w:t>
       </w:r>
       <w:r>
         <w:t xml:space="preserve"> </w:t>
@@ -823,7 +823,7 @@
         <w:pStyle w:val="BodyText"/>
       </w:pPr>
       <w:r>
-        <w:t xml:space="preserve">The two paid verdicts are good for diagnosis, not repair: a split vote marks an answer the model cannot reproduce, and a judge answering</w:t>
+        <w:t xml:space="preserve">Voting's and the judge's verdicts are good for diagnosis, not repair: a split vote marks an answer the model cannot reproduce, and a judge answering</w:t>
       </w:r>
       <w:r>
         <w:t xml:space="preserve"> </w:t>
@@ -928,7 +928,7 @@
         <w:pStyle w:val="BodyText"/>
       </w:pPr>
       <w:r>
-        <w:t xml:space="preserve">Figure 3 reads each verdict as a shipping rule over the same 230 records; three relationships hold.</w:t>
+        <w:t xml:space="preserve">Figure 3 reads each verdict as a shipping rule over the same 230 records. Three things hold.</w:t>
       </w:r>
     </w:p>
     <w:p>
@@ -936,7 +936,7 @@
         <w:pStyle w:val="BodyText"/>
       </w:pPr>
       <w:r>
-        <w:t xml:space="preserve">First, any verdict raises the accuracy of what passes, because withholding is a layer's only lever. No rule ships more than the 88 right answers the extractor found, so every gain in accuracy is paid for in right answers held back. Accuracy alone flatters any guard. Yield, right answers over all records, cannot be, so we report both.</w:t>
+        <w:t xml:space="preserve">First, any verdict raises the accuracy of what passes, because withholding is a layer's only lever. No rule ships more than the 88 right answers the extractor found, so every gain in accuracy is paid for in right answers held back. Accuracy alone flatters any guard. Yield, right answers over all records, cannot be flattered, so we report both.</w:t>
       </w:r>
     </w:p>
     <w:p>
@@ -1049,7 +1049,7 @@
         <w:pStyle w:val="BodyText"/>
       </w:pPr>
       <w:r>
-        <w:t xml:space="preserve">Once a mention is found, the rest of the pipeline is reliable: the right concept reaches the menu for 93 percent of found spans and the model picks it 81 percent of the time. The loss is at finding. Nearly half the annotated mentions are never quoted as the annotators marked them, and none of the reasons are medical: single words like</w:t>
+        <w:t xml:space="preserve">Once a mention is found, the pipeline is reliable: the right concept reaches the menu for 93 percent of found spans and the model picks it 81 percent of the time. The loss is at finding. Nearly half the annotated mentions are never quoted as the annotators marked them, and none of the reasons are medical: single words like</w:t>
       </w:r>
       <w:r>
         <w:t xml:space="preserve"> </w:t>
@@ -1124,7 +1124,7 @@
         <w:t xml:space="preserve"> </w:t>
       </w:r>
       <w:r>
-        <w:t xml:space="preserve">Every layer above the extractor checks, re-asks, votes on, judges or withholds an answer the extractor already gave; none can find a mention it missed. So the most any stack can ever get right is what the extractor found in the first place: on the held-out split, just over half the annotated mentions, a detection F1 of 0.521. The one way past that ceiling is a second reader: a different model family shown the post and the first model's quotes and asked what was missed. We did not build it. Its additions would be proposals, not verifications, needing the same measurement as the extractor's.</w:t>
+        <w:t xml:space="preserve">Every layer above the extractor checks, re-asks, votes on, judges or withholds an answer the extractor already gave; none can find a mention it missed. So the most any stack can ever get right is what the extractor found in the first place: on the held-out split, just over half the annotated mentions, a detection F1 of 0.521. The one way past that ceiling is a second reader: a different model family shown the post and the first model's quotes, asked what was missed. We did not build it. Its additions would be proposals, needing the same measurement as the extractor's.</w:t>
       </w:r>
     </w:p>
     <w:bookmarkEnd w:id="27"/>
@@ -1198,7 +1198,7 @@
         <w:t xml:space="preserve"> </w:t>
       </w:r>
       <w:r>
-        <w:t xml:space="preserve">Agrees where the vocabulary's names are evidence, reverses where they are not. Clinical vocabularies agree; gazetteers do not: a place name matches the vocabulary and is still the wrong place, and on one news corpus the check endorses the likelier-wrong answers. On financial tag names it never fires.</w:t>
+        <w:t xml:space="preserve">Holds where the vocabulary's names are evidence and reverses where they are not. Clinical vocabularies behave as SNOMED did; gazetteers do not: a place name matches the vocabulary and is still the wrong place, and on one news corpus the check endorses the answers more likely to be wrong. On financial tag names it never fires.</w:t>
       </w:r>
     </w:p>
     <w:p>
@@ -1354,7 +1354,7 @@
         <w:pStyle w:val="BodyText"/>
       </w:pPr>
       <w:r>
-        <w:t xml:space="preserve">The first was the unread verdicts above. The second was the metric: voting overwrote codes without re-running the vocabulary check, so records shipped marked</w:t>
+        <w:t xml:space="preserve">The first was the unread verdicts. The second was the metric: voting overwrote codes without re-running the vocabulary check, so records shipped marked</w:t>
       </w:r>
       <w:r>
         <w:t xml:space="preserve"> </w:t>

</xml_diff>